<commit_message>
docs: add roadmap draft
</commit_message>
<xml_diff>
--- a/docs/04-mvp-scope.docx
+++ b/docs/04-mvp-scope.docx
@@ -122,7 +122,9 @@
               <w:tab w:val="right" w:leader="dot" w:pos="9016"/>
             </w:tabs>
             <w:rPr>
+              <w:rFonts w:eastAsiaTheme="minorEastAsia"/>
               <w:noProof/>
+              <w:lang w:eastAsia="en-GB"/>
             </w:rPr>
           </w:pPr>
           <w:r>
@@ -134,7 +136,7 @@
           <w:r>
             <w:fldChar w:fldCharType="separate"/>
           </w:r>
-          <w:hyperlink w:anchor="_Toc230349338" w:history="1">
+          <w:hyperlink w:anchor="_Toc230349591" w:history="1">
             <w:r>
               <w:rPr>
                 <w:rStyle w:val="Hyperlink"/>
@@ -161,7 +163,7 @@
                 <w:noProof/>
                 <w:webHidden/>
               </w:rPr>
-              <w:instrText xml:space="preserve"> PAGEREF _Toc230349338 \h </w:instrText>
+              <w:instrText xml:space="preserve"> PAGEREF _Toc230349591 \h </w:instrText>
             </w:r>
             <w:r>
               <w:rPr>
@@ -199,10 +201,12 @@
               <w:tab w:val="right" w:leader="dot" w:pos="9016"/>
             </w:tabs>
             <w:rPr>
+              <w:rFonts w:eastAsiaTheme="minorEastAsia"/>
               <w:noProof/>
+              <w:lang w:eastAsia="en-GB"/>
             </w:rPr>
           </w:pPr>
-          <w:hyperlink w:anchor="_Toc230349339" w:history="1">
+          <w:hyperlink w:anchor="_Toc230349592" w:history="1">
             <w:r>
               <w:rPr>
                 <w:rStyle w:val="Hyperlink"/>
@@ -229,7 +233,7 @@
                 <w:noProof/>
                 <w:webHidden/>
               </w:rPr>
-              <w:instrText xml:space="preserve"> PAGEREF _Toc230349339 \h </w:instrText>
+              <w:instrText xml:space="preserve"> PAGEREF _Toc230349592 \h </w:instrText>
             </w:r>
             <w:r>
               <w:rPr>
@@ -267,10 +271,12 @@
               <w:tab w:val="right" w:leader="dot" w:pos="9016"/>
             </w:tabs>
             <w:rPr>
+              <w:rFonts w:eastAsiaTheme="minorEastAsia"/>
               <w:noProof/>
+              <w:lang w:eastAsia="en-GB"/>
             </w:rPr>
           </w:pPr>
-          <w:hyperlink w:anchor="_Toc230349340" w:history="1">
+          <w:hyperlink w:anchor="_Toc230349593" w:history="1">
             <w:r>
               <w:rPr>
                 <w:rStyle w:val="Hyperlink"/>
@@ -297,7 +303,7 @@
                 <w:noProof/>
                 <w:webHidden/>
               </w:rPr>
-              <w:instrText xml:space="preserve"> PAGEREF _Toc230349340 \h </w:instrText>
+              <w:instrText xml:space="preserve"> PAGEREF _Toc230349593 \h </w:instrText>
             </w:r>
             <w:r>
               <w:rPr>
@@ -335,10 +341,12 @@
               <w:tab w:val="right" w:leader="dot" w:pos="9016"/>
             </w:tabs>
             <w:rPr>
+              <w:rFonts w:eastAsiaTheme="minorEastAsia"/>
               <w:noProof/>
+              <w:lang w:eastAsia="en-GB"/>
             </w:rPr>
           </w:pPr>
-          <w:hyperlink w:anchor="_Toc230349341" w:history="1">
+          <w:hyperlink w:anchor="_Toc230349594" w:history="1">
             <w:r>
               <w:rPr>
                 <w:rStyle w:val="Hyperlink"/>
@@ -365,7 +373,7 @@
                 <w:noProof/>
                 <w:webHidden/>
               </w:rPr>
-              <w:instrText xml:space="preserve"> PAGEREF _Toc230349341 \h </w:instrText>
+              <w:instrText xml:space="preserve"> PAGEREF _Toc230349594 \h </w:instrText>
             </w:r>
             <w:r>
               <w:rPr>
@@ -403,10 +411,12 @@
               <w:tab w:val="right" w:leader="dot" w:pos="9016"/>
             </w:tabs>
             <w:rPr>
+              <w:rFonts w:eastAsiaTheme="minorEastAsia"/>
               <w:noProof/>
+              <w:lang w:eastAsia="en-GB"/>
             </w:rPr>
           </w:pPr>
-          <w:hyperlink w:anchor="_Toc230349342" w:history="1">
+          <w:hyperlink w:anchor="_Toc230349595" w:history="1">
             <w:r>
               <w:rPr>
                 <w:rStyle w:val="Hyperlink"/>
@@ -433,7 +443,7 @@
                 <w:noProof/>
                 <w:webHidden/>
               </w:rPr>
-              <w:instrText xml:space="preserve"> PAGEREF _Toc230349342 \h </w:instrText>
+              <w:instrText xml:space="preserve"> PAGEREF _Toc230349595 \h </w:instrText>
             </w:r>
             <w:r>
               <w:rPr>
@@ -471,10 +481,12 @@
               <w:tab w:val="right" w:leader="dot" w:pos="9016"/>
             </w:tabs>
             <w:rPr>
+              <w:rFonts w:eastAsiaTheme="minorEastAsia"/>
               <w:noProof/>
+              <w:lang w:eastAsia="en-GB"/>
             </w:rPr>
           </w:pPr>
-          <w:hyperlink w:anchor="_Toc230349343" w:history="1">
+          <w:hyperlink w:anchor="_Toc230349596" w:history="1">
             <w:r>
               <w:rPr>
                 <w:rStyle w:val="Hyperlink"/>
@@ -501,7 +513,7 @@
                 <w:noProof/>
                 <w:webHidden/>
               </w:rPr>
-              <w:instrText xml:space="preserve"> PAGEREF _Toc230349343 \h </w:instrText>
+              <w:instrText xml:space="preserve"> PAGEREF _Toc230349596 \h </w:instrText>
             </w:r>
             <w:r>
               <w:rPr>
@@ -539,10 +551,12 @@
               <w:tab w:val="right" w:leader="dot" w:pos="9016"/>
             </w:tabs>
             <w:rPr>
+              <w:rFonts w:eastAsiaTheme="minorEastAsia"/>
               <w:noProof/>
+              <w:lang w:eastAsia="en-GB"/>
             </w:rPr>
           </w:pPr>
-          <w:hyperlink w:anchor="_Toc230349344" w:history="1">
+          <w:hyperlink w:anchor="_Toc230349597" w:history="1">
             <w:r>
               <w:rPr>
                 <w:rStyle w:val="Hyperlink"/>
@@ -569,7 +583,7 @@
                 <w:noProof/>
                 <w:webHidden/>
               </w:rPr>
-              <w:instrText xml:space="preserve"> PAGEREF _Toc230349344 \h </w:instrText>
+              <w:instrText xml:space="preserve"> PAGEREF _Toc230349597 \h </w:instrText>
             </w:r>
             <w:r>
               <w:rPr>
@@ -607,10 +621,12 @@
               <w:tab w:val="right" w:leader="dot" w:pos="9016"/>
             </w:tabs>
             <w:rPr>
+              <w:rFonts w:eastAsiaTheme="minorEastAsia"/>
               <w:noProof/>
+              <w:lang w:eastAsia="en-GB"/>
             </w:rPr>
           </w:pPr>
-          <w:hyperlink w:anchor="_Toc230349345" w:history="1">
+          <w:hyperlink w:anchor="_Toc230349598" w:history="1">
             <w:r>
               <w:rPr>
                 <w:rStyle w:val="Hyperlink"/>
@@ -637,7 +653,7 @@
                 <w:noProof/>
                 <w:webHidden/>
               </w:rPr>
-              <w:instrText xml:space="preserve"> PAGEREF _Toc230349345 \h </w:instrText>
+              <w:instrText xml:space="preserve"> PAGEREF _Toc230349598 \h </w:instrText>
             </w:r>
             <w:r>
               <w:rPr>
@@ -675,10 +691,12 @@
               <w:tab w:val="right" w:leader="dot" w:pos="9016"/>
             </w:tabs>
             <w:rPr>
+              <w:rFonts w:eastAsiaTheme="minorEastAsia"/>
               <w:noProof/>
+              <w:lang w:eastAsia="en-GB"/>
             </w:rPr>
           </w:pPr>
-          <w:hyperlink w:anchor="_Toc230349346" w:history="1">
+          <w:hyperlink w:anchor="_Toc230349599" w:history="1">
             <w:r>
               <w:rPr>
                 <w:rStyle w:val="Hyperlink"/>
@@ -705,7 +723,7 @@
                 <w:noProof/>
                 <w:webHidden/>
               </w:rPr>
-              <w:instrText xml:space="preserve"> PAGEREF _Toc230349346 \h </w:instrText>
+              <w:instrText xml:space="preserve"> PAGEREF _Toc230349599 \h </w:instrText>
             </w:r>
             <w:r>
               <w:rPr>
@@ -743,10 +761,12 @@
               <w:tab w:val="right" w:leader="dot" w:pos="9016"/>
             </w:tabs>
             <w:rPr>
+              <w:rFonts w:eastAsiaTheme="minorEastAsia"/>
               <w:noProof/>
+              <w:lang w:eastAsia="en-GB"/>
             </w:rPr>
           </w:pPr>
-          <w:hyperlink w:anchor="_Toc230349347" w:history="1">
+          <w:hyperlink w:anchor="_Toc230349600" w:history="1">
             <w:r>
               <w:rPr>
                 <w:rStyle w:val="Hyperlink"/>
@@ -773,7 +793,7 @@
                 <w:noProof/>
                 <w:webHidden/>
               </w:rPr>
-              <w:instrText xml:space="preserve"> PAGEREF _Toc230349347 \h </w:instrText>
+              <w:instrText xml:space="preserve"> PAGEREF _Toc230349600 \h </w:instrText>
             </w:r>
             <w:r>
               <w:rPr>
@@ -811,10 +831,12 @@
               <w:tab w:val="right" w:leader="dot" w:pos="9016"/>
             </w:tabs>
             <w:rPr>
+              <w:rFonts w:eastAsiaTheme="minorEastAsia"/>
               <w:noProof/>
+              <w:lang w:eastAsia="en-GB"/>
             </w:rPr>
           </w:pPr>
-          <w:hyperlink w:anchor="_Toc230349348" w:history="1">
+          <w:hyperlink w:anchor="_Toc230349601" w:history="1">
             <w:r>
               <w:rPr>
                 <w:rStyle w:val="Hyperlink"/>
@@ -841,7 +863,7 @@
                 <w:noProof/>
                 <w:webHidden/>
               </w:rPr>
-              <w:instrText xml:space="preserve"> PAGEREF _Toc230349348 \h </w:instrText>
+              <w:instrText xml:space="preserve"> PAGEREF _Toc230349601 \h </w:instrText>
             </w:r>
             <w:r>
               <w:rPr>
@@ -879,10 +901,12 @@
               <w:tab w:val="right" w:leader="dot" w:pos="9016"/>
             </w:tabs>
             <w:rPr>
+              <w:rFonts w:eastAsiaTheme="minorEastAsia"/>
               <w:noProof/>
+              <w:lang w:eastAsia="en-GB"/>
             </w:rPr>
           </w:pPr>
-          <w:hyperlink w:anchor="_Toc230349349" w:history="1">
+          <w:hyperlink w:anchor="_Toc230349602" w:history="1">
             <w:r>
               <w:rPr>
                 <w:rStyle w:val="Hyperlink"/>
@@ -909,7 +933,7 @@
                 <w:noProof/>
                 <w:webHidden/>
               </w:rPr>
-              <w:instrText xml:space="preserve"> PAGEREF _Toc230349349 \h </w:instrText>
+              <w:instrText xml:space="preserve"> PAGEREF _Toc230349602 \h </w:instrText>
             </w:r>
             <w:r>
               <w:rPr>
@@ -947,10 +971,12 @@
               <w:tab w:val="right" w:leader="dot" w:pos="9016"/>
             </w:tabs>
             <w:rPr>
+              <w:rFonts w:eastAsiaTheme="minorEastAsia"/>
               <w:noProof/>
+              <w:lang w:eastAsia="en-GB"/>
             </w:rPr>
           </w:pPr>
-          <w:hyperlink w:anchor="_Toc230349350" w:history="1">
+          <w:hyperlink w:anchor="_Toc230349603" w:history="1">
             <w:r>
               <w:rPr>
                 <w:rStyle w:val="Hyperlink"/>
@@ -977,7 +1003,7 @@
                 <w:noProof/>
                 <w:webHidden/>
               </w:rPr>
-              <w:instrText xml:space="preserve"> PAGEREF _Toc230349350 \h </w:instrText>
+              <w:instrText xml:space="preserve"> PAGEREF _Toc230349603 \h </w:instrText>
             </w:r>
             <w:r>
               <w:rPr>
@@ -1015,10 +1041,12 @@
               <w:tab w:val="right" w:leader="dot" w:pos="9016"/>
             </w:tabs>
             <w:rPr>
+              <w:rFonts w:eastAsiaTheme="minorEastAsia"/>
               <w:noProof/>
+              <w:lang w:eastAsia="en-GB"/>
             </w:rPr>
           </w:pPr>
-          <w:hyperlink w:anchor="_Toc230349351" w:history="1">
+          <w:hyperlink w:anchor="_Toc230349604" w:history="1">
             <w:r>
               <w:rPr>
                 <w:rStyle w:val="Hyperlink"/>
@@ -1045,7 +1073,7 @@
                 <w:noProof/>
                 <w:webHidden/>
               </w:rPr>
-              <w:instrText xml:space="preserve"> PAGEREF _Toc230349351 \h </w:instrText>
+              <w:instrText xml:space="preserve"> PAGEREF _Toc230349604 \h </w:instrText>
             </w:r>
             <w:r>
               <w:rPr>
@@ -1083,10 +1111,12 @@
               <w:tab w:val="right" w:leader="dot" w:pos="9016"/>
             </w:tabs>
             <w:rPr>
+              <w:rFonts w:eastAsiaTheme="minorEastAsia"/>
               <w:noProof/>
+              <w:lang w:eastAsia="en-GB"/>
             </w:rPr>
           </w:pPr>
-          <w:hyperlink w:anchor="_Toc230349352" w:history="1">
+          <w:hyperlink w:anchor="_Toc230349605" w:history="1">
             <w:r>
               <w:rPr>
                 <w:rStyle w:val="Hyperlink"/>
@@ -1113,7 +1143,7 @@
                 <w:noProof/>
                 <w:webHidden/>
               </w:rPr>
-              <w:instrText xml:space="preserve"> PAGEREF _Toc230349352 \h </w:instrText>
+              <w:instrText xml:space="preserve"> PAGEREF _Toc230349605 \h </w:instrText>
             </w:r>
             <w:r>
               <w:rPr>
@@ -1151,10 +1181,12 @@
               <w:tab w:val="right" w:leader="dot" w:pos="9016"/>
             </w:tabs>
             <w:rPr>
+              <w:rFonts w:eastAsiaTheme="minorEastAsia"/>
               <w:noProof/>
+              <w:lang w:eastAsia="en-GB"/>
             </w:rPr>
           </w:pPr>
-          <w:hyperlink w:anchor="_Toc230349353" w:history="1">
+          <w:hyperlink w:anchor="_Toc230349606" w:history="1">
             <w:r>
               <w:rPr>
                 <w:rStyle w:val="Hyperlink"/>
@@ -1181,7 +1213,7 @@
                 <w:noProof/>
                 <w:webHidden/>
               </w:rPr>
-              <w:instrText xml:space="preserve"> PAGEREF _Toc230349353 \h </w:instrText>
+              <w:instrText xml:space="preserve"> PAGEREF _Toc230349606 \h </w:instrText>
             </w:r>
             <w:r>
               <w:rPr>
@@ -1219,10 +1251,12 @@
               <w:tab w:val="right" w:leader="dot" w:pos="9016"/>
             </w:tabs>
             <w:rPr>
+              <w:rFonts w:eastAsiaTheme="minorEastAsia"/>
               <w:noProof/>
+              <w:lang w:eastAsia="en-GB"/>
             </w:rPr>
           </w:pPr>
-          <w:hyperlink w:anchor="_Toc230349354" w:history="1">
+          <w:hyperlink w:anchor="_Toc230349607" w:history="1">
             <w:r>
               <w:rPr>
                 <w:rStyle w:val="Hyperlink"/>
@@ -1249,7 +1283,7 @@
                 <w:noProof/>
                 <w:webHidden/>
               </w:rPr>
-              <w:instrText xml:space="preserve"> PAGEREF _Toc230349354 \h </w:instrText>
+              <w:instrText xml:space="preserve"> PAGEREF _Toc230349607 \h </w:instrText>
             </w:r>
             <w:r>
               <w:rPr>
@@ -1287,10 +1321,12 @@
               <w:tab w:val="right" w:leader="dot" w:pos="9016"/>
             </w:tabs>
             <w:rPr>
+              <w:rFonts w:eastAsiaTheme="minorEastAsia"/>
               <w:noProof/>
+              <w:lang w:eastAsia="en-GB"/>
             </w:rPr>
           </w:pPr>
-          <w:hyperlink w:anchor="_Toc230349355" w:history="1">
+          <w:hyperlink w:anchor="_Toc230349608" w:history="1">
             <w:r>
               <w:rPr>
                 <w:rStyle w:val="Hyperlink"/>
@@ -1317,7 +1353,7 @@
                 <w:noProof/>
                 <w:webHidden/>
               </w:rPr>
-              <w:instrText xml:space="preserve"> PAGEREF _Toc230349355 \h </w:instrText>
+              <w:instrText xml:space="preserve"> PAGEREF _Toc230349608 \h </w:instrText>
             </w:r>
             <w:r>
               <w:rPr>
@@ -1355,10 +1391,12 @@
               <w:tab w:val="right" w:leader="dot" w:pos="9016"/>
             </w:tabs>
             <w:rPr>
+              <w:rFonts w:eastAsiaTheme="minorEastAsia"/>
               <w:noProof/>
+              <w:lang w:eastAsia="en-GB"/>
             </w:rPr>
           </w:pPr>
-          <w:hyperlink w:anchor="_Toc230349356" w:history="1">
+          <w:hyperlink w:anchor="_Toc230349609" w:history="1">
             <w:r>
               <w:rPr>
                 <w:rStyle w:val="Hyperlink"/>
@@ -1385,7 +1423,7 @@
                 <w:noProof/>
                 <w:webHidden/>
               </w:rPr>
-              <w:instrText xml:space="preserve"> PAGEREF _Toc230349356 \h </w:instrText>
+              <w:instrText xml:space="preserve"> PAGEREF _Toc230349609 \h </w:instrText>
             </w:r>
             <w:r>
               <w:rPr>
@@ -1423,10 +1461,12 @@
               <w:tab w:val="right" w:leader="dot" w:pos="9016"/>
             </w:tabs>
             <w:rPr>
+              <w:rFonts w:eastAsiaTheme="minorEastAsia"/>
               <w:noProof/>
+              <w:lang w:eastAsia="en-GB"/>
             </w:rPr>
           </w:pPr>
-          <w:hyperlink w:anchor="_Toc230349357" w:history="1">
+          <w:hyperlink w:anchor="_Toc230349610" w:history="1">
             <w:r>
               <w:rPr>
                 <w:rStyle w:val="Hyperlink"/>
@@ -1453,7 +1493,7 @@
                 <w:noProof/>
                 <w:webHidden/>
               </w:rPr>
-              <w:instrText xml:space="preserve"> PAGEREF _Toc230349357 \h </w:instrText>
+              <w:instrText xml:space="preserve"> PAGEREF _Toc230349610 \h </w:instrText>
             </w:r>
             <w:r>
               <w:rPr>
@@ -1491,10 +1531,12 @@
               <w:tab w:val="right" w:leader="dot" w:pos="9016"/>
             </w:tabs>
             <w:rPr>
+              <w:rFonts w:eastAsiaTheme="minorEastAsia"/>
               <w:noProof/>
+              <w:lang w:eastAsia="en-GB"/>
             </w:rPr>
           </w:pPr>
-          <w:hyperlink w:anchor="_Toc230349358" w:history="1">
+          <w:hyperlink w:anchor="_Toc230349611" w:history="1">
             <w:r>
               <w:rPr>
                 <w:rStyle w:val="Hyperlink"/>
@@ -1521,7 +1563,7 @@
                 <w:noProof/>
                 <w:webHidden/>
               </w:rPr>
-              <w:instrText xml:space="preserve"> PAGEREF _Toc230349358 \h </w:instrText>
+              <w:instrText xml:space="preserve"> PAGEREF _Toc230349611 \h </w:instrText>
             </w:r>
             <w:r>
               <w:rPr>
@@ -1559,10 +1601,12 @@
               <w:tab w:val="right" w:leader="dot" w:pos="9016"/>
             </w:tabs>
             <w:rPr>
+              <w:rFonts w:eastAsiaTheme="minorEastAsia"/>
               <w:noProof/>
+              <w:lang w:eastAsia="en-GB"/>
             </w:rPr>
           </w:pPr>
-          <w:hyperlink w:anchor="_Toc230349359" w:history="1">
+          <w:hyperlink w:anchor="_Toc230349612" w:history="1">
             <w:r>
               <w:rPr>
                 <w:rStyle w:val="Hyperlink"/>
@@ -1589,7 +1633,7 @@
                 <w:noProof/>
                 <w:webHidden/>
               </w:rPr>
-              <w:instrText xml:space="preserve"> PAGEREF _Toc230349359 \h </w:instrText>
+              <w:instrText xml:space="preserve"> PAGEREF _Toc230349612 \h </w:instrText>
             </w:r>
             <w:r>
               <w:rPr>
@@ -1627,10 +1671,12 @@
               <w:tab w:val="right" w:leader="dot" w:pos="9016"/>
             </w:tabs>
             <w:rPr>
+              <w:rFonts w:eastAsiaTheme="minorEastAsia"/>
               <w:noProof/>
+              <w:lang w:eastAsia="en-GB"/>
             </w:rPr>
           </w:pPr>
-          <w:hyperlink w:anchor="_Toc230349360" w:history="1">
+          <w:hyperlink w:anchor="_Toc230349613" w:history="1">
             <w:r>
               <w:rPr>
                 <w:rStyle w:val="Hyperlink"/>
@@ -1657,7 +1703,7 @@
                 <w:noProof/>
                 <w:webHidden/>
               </w:rPr>
-              <w:instrText xml:space="preserve"> PAGEREF _Toc230349360 \h </w:instrText>
+              <w:instrText xml:space="preserve"> PAGEREF _Toc230349613 \h </w:instrText>
             </w:r>
             <w:r>
               <w:rPr>
@@ -1695,10 +1741,12 @@
               <w:tab w:val="right" w:leader="dot" w:pos="9016"/>
             </w:tabs>
             <w:rPr>
+              <w:rFonts w:eastAsiaTheme="minorEastAsia"/>
               <w:noProof/>
+              <w:lang w:eastAsia="en-GB"/>
             </w:rPr>
           </w:pPr>
-          <w:hyperlink w:anchor="_Toc230349361" w:history="1">
+          <w:hyperlink w:anchor="_Toc230349614" w:history="1">
             <w:r>
               <w:rPr>
                 <w:rStyle w:val="Hyperlink"/>
@@ -1725,7 +1773,7 @@
                 <w:noProof/>
                 <w:webHidden/>
               </w:rPr>
-              <w:instrText xml:space="preserve"> PAGEREF _Toc230349361 \h </w:instrText>
+              <w:instrText xml:space="preserve"> PAGEREF _Toc230349614 \h </w:instrText>
             </w:r>
             <w:r>
               <w:rPr>
@@ -1763,10 +1811,12 @@
               <w:tab w:val="right" w:leader="dot" w:pos="9016"/>
             </w:tabs>
             <w:rPr>
+              <w:rFonts w:eastAsiaTheme="minorEastAsia"/>
               <w:noProof/>
+              <w:lang w:eastAsia="en-GB"/>
             </w:rPr>
           </w:pPr>
-          <w:hyperlink w:anchor="_Toc230349362" w:history="1">
+          <w:hyperlink w:anchor="_Toc230349615" w:history="1">
             <w:r>
               <w:rPr>
                 <w:rStyle w:val="Hyperlink"/>
@@ -1793,7 +1843,7 @@
                 <w:noProof/>
                 <w:webHidden/>
               </w:rPr>
-              <w:instrText xml:space="preserve"> PAGEREF _Toc230349362 \h </w:instrText>
+              <w:instrText xml:space="preserve"> PAGEREF _Toc230349615 \h </w:instrText>
             </w:r>
             <w:r>
               <w:rPr>
@@ -1844,7 +1894,7 @@
       <w:pPr>
         <w:pStyle w:val="Heading1"/>
       </w:pPr>
-      <w:bookmarkStart w:id="0" w:name="_Toc230349338"/>
+      <w:bookmarkStart w:id="0" w:name="_Toc230349591"/>
       <w:r>
         <w:t>1. MVP Purpose</w:t>
       </w:r>
@@ -1864,7 +1914,7 @@
       <w:pPr>
         <w:pStyle w:val="Heading1"/>
       </w:pPr>
-      <w:bookmarkStart w:id="1" w:name="_Toc230349339"/>
+      <w:bookmarkStart w:id="1" w:name="_Toc230349592"/>
       <w:r>
         <w:t>2. MVP Overview</w:t>
       </w:r>
@@ -1889,7 +1939,7 @@
       <w:pPr>
         <w:pStyle w:val="Heading1"/>
       </w:pPr>
-      <w:bookmarkStart w:id="2" w:name="_Toc230349340"/>
+      <w:bookmarkStart w:id="2" w:name="_Toc230349593"/>
       <w:r>
         <w:t>3. MVP Goals</w:t>
       </w:r>
@@ -1980,7 +2030,7 @@
       <w:pPr>
         <w:pStyle w:val="Heading1"/>
       </w:pPr>
-      <w:bookmarkStart w:id="3" w:name="_Toc230349341"/>
+      <w:bookmarkStart w:id="3" w:name="_Toc230349594"/>
       <w:r>
         <w:t>4. Target Users</w:t>
       </w:r>
@@ -2419,7 +2469,7 @@
       <w:pPr>
         <w:pStyle w:val="Heading1"/>
       </w:pPr>
-      <w:bookmarkStart w:id="4" w:name="_Toc230349342"/>
+      <w:bookmarkStart w:id="4" w:name="_Toc230349595"/>
       <w:r>
         <w:t>5. Scope Principles</w:t>
       </w:r>
@@ -2518,7 +2568,7 @@
       <w:pPr>
         <w:pStyle w:val="Heading1"/>
       </w:pPr>
-      <w:bookmarkStart w:id="5" w:name="_Toc230349343"/>
+      <w:bookmarkStart w:id="5" w:name="_Toc230349596"/>
       <w:r>
         <w:t>6. In-Scope MVP Features</w:t>
       </w:r>
@@ -2736,6 +2786,7 @@
                 <w:bCs/>
               </w:rPr>
             </w:pPr>
+            <w:proofErr w:type="gramStart"/>
             <w:r>
               <w:rPr>
                 <w:bCs/>
@@ -2750,12 +2801,29 @@
               </w:rPr>
               <w:t>s</w:t>
             </w:r>
-            <w:r>
-              <w:rPr>
-                <w:bCs/>
-                <w:sz w:val="18"/>
-              </w:rPr>
-              <w:t xml:space="preserve"> users understand where they are logging drinks and what options are available.</w:t>
+            <w:proofErr w:type="gramEnd"/>
+            <w:r>
+              <w:rPr>
+                <w:bCs/>
+                <w:sz w:val="18"/>
+              </w:rPr>
+              <w:t xml:space="preserve"> users understand where they are </w:t>
+            </w:r>
+            <w:proofErr w:type="gramStart"/>
+            <w:r>
+              <w:rPr>
+                <w:bCs/>
+                <w:sz w:val="18"/>
+              </w:rPr>
+              <w:t>logging</w:t>
+            </w:r>
+            <w:proofErr w:type="gramEnd"/>
+            <w:r>
+              <w:rPr>
+                <w:bCs/>
+                <w:sz w:val="18"/>
+              </w:rPr>
+              <w:t xml:space="preserve"> drinks and what options are available.</w:t>
             </w:r>
           </w:p>
         </w:tc>
@@ -3202,7 +3270,7 @@
       <w:pPr>
         <w:pStyle w:val="Heading2"/>
       </w:pPr>
-      <w:bookmarkStart w:id="6" w:name="_Toc230349344"/>
+      <w:bookmarkStart w:id="6" w:name="_Toc230349597"/>
       <w:r>
         <w:t>6.1 Venue Discovery</w:t>
       </w:r>
@@ -3217,7 +3285,7 @@
       <w:pPr>
         <w:pStyle w:val="Heading2"/>
       </w:pPr>
-      <w:bookmarkStart w:id="7" w:name="_Toc230349345"/>
+      <w:bookmarkStart w:id="7" w:name="_Toc230349598"/>
       <w:r>
         <w:t>6.2 Venue Details</w:t>
       </w:r>
@@ -3232,7 +3300,7 @@
       <w:pPr>
         <w:pStyle w:val="Heading2"/>
       </w:pPr>
-      <w:bookmarkStart w:id="8" w:name="_Toc230349346"/>
+      <w:bookmarkStart w:id="8" w:name="_Toc230349599"/>
       <w:r>
         <w:t>6.3 Drink Menus and Prices</w:t>
       </w:r>
@@ -3240,14 +3308,22 @@
     </w:p>
     <w:p>
       <w:r>
-        <w:t>Drink menus and prices should be included in a simplified form. The MVP does not need live integrations with venues. Sample menus are acceptable as long as they demonstrate how the feature would work.</w:t>
+        <w:t xml:space="preserve">Drink menus and prices should be included in a simplified form. The MVP does not need live integrations with venues. Sample menus are acceptable </w:t>
+      </w:r>
+      <w:proofErr w:type="gramStart"/>
+      <w:r>
+        <w:t>as long as</w:t>
+      </w:r>
+      <w:proofErr w:type="gramEnd"/>
+      <w:r>
+        <w:t xml:space="preserve"> they demonstrate how the feature would work.</w:t>
       </w:r>
     </w:p>
     <w:p>
       <w:pPr>
         <w:pStyle w:val="Heading2"/>
       </w:pPr>
-      <w:bookmarkStart w:id="9" w:name="_Toc230349347"/>
+      <w:bookmarkStart w:id="9" w:name="_Toc230349600"/>
       <w:r>
         <w:t>6.4 Manual Drink Logging</w:t>
       </w:r>
@@ -3262,7 +3338,7 @@
       <w:pPr>
         <w:pStyle w:val="Heading2"/>
       </w:pPr>
-      <w:bookmarkStart w:id="10" w:name="_Toc230349348"/>
+      <w:bookmarkStart w:id="10" w:name="_Toc230349601"/>
       <w:r>
         <w:t>6.5 Daily Summary</w:t>
       </w:r>
@@ -3283,7 +3359,7 @@
       <w:pPr>
         <w:pStyle w:val="Heading2"/>
       </w:pPr>
-      <w:bookmarkStart w:id="11" w:name="_Toc230349349"/>
+      <w:bookmarkStart w:id="11" w:name="_Toc230349602"/>
       <w:r>
         <w:t>6.6 Weekly Summary</w:t>
       </w:r>
@@ -3298,7 +3374,7 @@
       <w:pPr>
         <w:pStyle w:val="Heading2"/>
       </w:pPr>
-      <w:bookmarkStart w:id="12" w:name="_Toc230349350"/>
+      <w:bookmarkStart w:id="12" w:name="_Toc230349603"/>
       <w:r>
         <w:t>6.7 AI-Generated Insights</w:t>
       </w:r>
@@ -3313,7 +3389,7 @@
       <w:pPr>
         <w:pStyle w:val="Heading2"/>
       </w:pPr>
-      <w:bookmarkStart w:id="13" w:name="_Toc230349351"/>
+      <w:bookmarkStart w:id="13" w:name="_Toc230349604"/>
       <w:r>
         <w:lastRenderedPageBreak/>
         <w:t>6.8 Responsible Design</w:t>
@@ -3329,7 +3405,7 @@
       <w:pPr>
         <w:pStyle w:val="Heading1"/>
       </w:pPr>
-      <w:bookmarkStart w:id="14" w:name="_Toc230349352"/>
+      <w:bookmarkStart w:id="14" w:name="_Toc230349605"/>
       <w:r>
         <w:t>7. Out of Scope for MVP</w:t>
       </w:r>
@@ -3799,7 +3875,7 @@
       <w:pPr>
         <w:pStyle w:val="Heading1"/>
       </w:pPr>
-      <w:bookmarkStart w:id="15" w:name="_Toc230349353"/>
+      <w:bookmarkStart w:id="15" w:name="_Toc230349606"/>
       <w:r>
         <w:t>8. MVP User Journey</w:t>
       </w:r>
@@ -4013,7 +4089,7 @@
       <w:pPr>
         <w:pStyle w:val="Heading1"/>
       </w:pPr>
-      <w:bookmarkStart w:id="16" w:name="_Toc230349354"/>
+      <w:bookmarkStart w:id="16" w:name="_Toc230349607"/>
       <w:r>
         <w:t>9. MVP Feature Requirements</w:t>
       </w:r>
@@ -5020,7 +5096,7 @@
       <w:pPr>
         <w:pStyle w:val="Heading1"/>
       </w:pPr>
-      <w:bookmarkStart w:id="17" w:name="_Toc230349355"/>
+      <w:bookmarkStart w:id="17" w:name="_Toc230349608"/>
       <w:r>
         <w:t>10. Data Requirements</w:t>
       </w:r>
@@ -5451,7 +5527,7 @@
       <w:pPr>
         <w:pStyle w:val="Heading1"/>
       </w:pPr>
-      <w:bookmarkStart w:id="18" w:name="_Toc230349356"/>
+      <w:bookmarkStart w:id="18" w:name="_Toc230349609"/>
       <w:r>
         <w:t>11. Non-Functional Requirements</w:t>
       </w:r>
@@ -5750,7 +5826,23 @@
                 <w:bCs/>
                 <w:sz w:val="18"/>
               </w:rPr>
-              <w:t>Logged drinks should be stored consistently and summaries should update correctly.</w:t>
+              <w:t xml:space="preserve">Logged drinks should be stored consistently and summaries should </w:t>
+            </w:r>
+            <w:proofErr w:type="gramStart"/>
+            <w:r>
+              <w:rPr>
+                <w:bCs/>
+                <w:sz w:val="18"/>
+              </w:rPr>
+              <w:t>update</w:t>
+            </w:r>
+            <w:proofErr w:type="gramEnd"/>
+            <w:r>
+              <w:rPr>
+                <w:bCs/>
+                <w:sz w:val="18"/>
+              </w:rPr>
+              <w:t xml:space="preserve"> correctly.</w:t>
             </w:r>
           </w:p>
         </w:tc>
@@ -5850,7 +5942,7 @@
       <w:pPr>
         <w:pStyle w:val="Heading1"/>
       </w:pPr>
-      <w:bookmarkStart w:id="19" w:name="_Toc230349357"/>
+      <w:bookmarkStart w:id="19" w:name="_Toc230349610"/>
       <w:r>
         <w:lastRenderedPageBreak/>
         <w:t>12. Assumptions</w:t>
@@ -6268,7 +6360,7 @@
       <w:pPr>
         <w:pStyle w:val="Heading1"/>
       </w:pPr>
-      <w:bookmarkStart w:id="20" w:name="_Toc230349358"/>
+      <w:bookmarkStart w:id="20" w:name="_Toc230349611"/>
       <w:r>
         <w:t>13. Risks and Mitigations</w:t>
       </w:r>
@@ -6778,7 +6870,7 @@
       <w:pPr>
         <w:pStyle w:val="Heading1"/>
       </w:pPr>
-      <w:bookmarkStart w:id="21" w:name="_Toc230349359"/>
+      <w:bookmarkStart w:id="21" w:name="_Toc230349612"/>
       <w:r>
         <w:t>14. MVP Acceptance Criteria</w:t>
       </w:r>
@@ -7069,7 +7161,7 @@
       <w:pPr>
         <w:pStyle w:val="Heading1"/>
       </w:pPr>
-      <w:bookmarkStart w:id="22" w:name="_Toc230349360"/>
+      <w:bookmarkStart w:id="22" w:name="_Toc230349613"/>
       <w:r>
         <w:lastRenderedPageBreak/>
         <w:t>15. Feature Prioritisation</w:t>
@@ -7320,7 +7412,7 @@
       <w:pPr>
         <w:pStyle w:val="Heading1"/>
       </w:pPr>
-      <w:bookmarkStart w:id="23" w:name="_Toc230349361"/>
+      <w:bookmarkStart w:id="23" w:name="_Toc230349614"/>
       <w:r>
         <w:t>16. Dependencies</w:t>
       </w:r>
@@ -7505,7 +7597,7 @@
       <w:pPr>
         <w:pStyle w:val="Heading1"/>
       </w:pPr>
-      <w:bookmarkStart w:id="24" w:name="_Toc230349362"/>
+      <w:bookmarkStart w:id="24" w:name="_Toc230349615"/>
       <w:r>
         <w:t>17. Summary</w:t>
       </w:r>

</xml_diff>